<commit_message>
Permitir usar el panel web sin túnel SSH y documentar acceso remoto
app.js no inicializaba nada (config, ALSA, etc.) si el navegador no
exponía getUserMedia -- eso pasa siempre que se entra por un origen
que no sea localhost (ej. http://brumexa.local:3000 en vez del túnel
SSH), aunque en Raspberry con modo nativo el mic lo captura la Pi por
ALSA y nunca depende del navegador. Ahora solo se deshabilita el botón
de mic cuando de verdad hace falta.

README documenta cómo entrar sin SSH (brumexa.local en station, IP
fija en modo AP) y cómo funciona el fallback AP/station de lib/wifi.js.
</commit_message>
<xml_diff>
--- a/cableado V1.docx
+++ b/cableado V1.docx
@@ -13,7 +13,6 @@
           <w:kern w:val="36"/>
           <w:sz w:val="48"/>
           <w:szCs w:val="48"/>
-          <w:u w:val="single"/>
           <w:lang w:eastAsia="es-AR"/>
         </w:rPr>
       </w:pPr>
@@ -63,8 +62,22 @@
           <w:szCs w:val="48"/>
           <w:lang w:eastAsia="es-AR"/>
         </w:rPr>
-        <w:t xml:space="preserve"> Cableado GENERAL (todo junto)</w:t>
+        <w:t xml:space="preserve"> Cableado GENERAL </w:t>
       </w:r>
+    </w:p>
+    <w:p>
+      <w:pPr>
+        <w:spacing w:before="100" w:beforeAutospacing="1" w:after="100" w:afterAutospacing="1" w:line="240" w:lineRule="auto"/>
+        <w:outlineLvl w:val="0"/>
+        <w:rPr>
+          <w:rFonts w:ascii="Times New Roman" w:eastAsia="Times New Roman" w:hAnsi="Times New Roman" w:cs="Times New Roman"/>
+          <w:b/>
+          <w:bCs/>
+          <w:sz w:val="36"/>
+          <w:szCs w:val="36"/>
+          <w:lang w:eastAsia="es-AR"/>
+        </w:rPr>
+      </w:pPr>
       <w:r>
         <w:rPr>
           <w:rFonts w:ascii="Times New Roman" w:eastAsia="Times New Roman" w:hAnsi="Times New Roman" w:cs="Times New Roman"/>
@@ -77,33 +90,6 @@
         </w:rPr>
         <w:br/>
       </w:r>
-      <w:r>
-        <w:rPr>
-          <w:rFonts w:ascii="Times New Roman" w:eastAsia="Times New Roman" w:hAnsi="Times New Roman" w:cs="Times New Roman"/>
-          <w:b/>
-          <w:bCs/>
-          <w:kern w:val="36"/>
-          <w:sz w:val="48"/>
-          <w:szCs w:val="48"/>
-          <w:lang w:eastAsia="es-AR"/>
-        </w:rPr>
-        <w:br/>
-        <w:t>falta GPIO19 PIN 35</w:t>
-      </w:r>
-    </w:p>
-    <w:p>
-      <w:pPr>
-        <w:spacing w:before="100" w:beforeAutospacing="1" w:after="100" w:afterAutospacing="1" w:line="240" w:lineRule="auto"/>
-        <w:outlineLvl w:val="1"/>
-        <w:rPr>
-          <w:rFonts w:ascii="Times New Roman" w:eastAsia="Times New Roman" w:hAnsi="Times New Roman" w:cs="Times New Roman"/>
-          <w:b/>
-          <w:bCs/>
-          <w:sz w:val="36"/>
-          <w:szCs w:val="36"/>
-          <w:lang w:eastAsia="es-AR"/>
-        </w:rPr>
-      </w:pPr>
       <w:r>
         <w:rPr>
           <w:rFonts w:ascii="Segoe UI Emoji" w:eastAsia="Times New Roman" w:hAnsi="Segoe UI Emoji" w:cs="Segoe UI Emoji"/>
@@ -263,14 +249,16 @@
                 <w:rFonts w:ascii="Times New Roman" w:eastAsia="Times New Roman" w:hAnsi="Times New Roman" w:cs="Times New Roman"/>
                 <w:sz w:val="24"/>
                 <w:szCs w:val="24"/>
-                <w:lang w:eastAsia="es-AR"/>
-              </w:rPr>
-            </w:pPr>
-            <w:r>
-              <w:rPr>
-                <w:rFonts w:ascii="Times New Roman" w:eastAsia="Times New Roman" w:hAnsi="Times New Roman" w:cs="Times New Roman"/>
-                <w:sz w:val="24"/>
-                <w:szCs w:val="24"/>
+                <w:highlight w:val="yellow"/>
+                <w:lang w:eastAsia="es-AR"/>
+              </w:rPr>
+            </w:pPr>
+            <w:r>
+              <w:rPr>
+                <w:rFonts w:ascii="Times New Roman" w:eastAsia="Times New Roman" w:hAnsi="Times New Roman" w:cs="Times New Roman"/>
+                <w:sz w:val="24"/>
+                <w:szCs w:val="24"/>
+                <w:highlight w:val="yellow"/>
                 <w:lang w:eastAsia="es-AR"/>
               </w:rPr>
               <w:t>VDD</w:t>
@@ -290,14 +278,16 @@
                 <w:rFonts w:ascii="Times New Roman" w:eastAsia="Times New Roman" w:hAnsi="Times New Roman" w:cs="Times New Roman"/>
                 <w:sz w:val="24"/>
                 <w:szCs w:val="24"/>
-                <w:lang w:eastAsia="es-AR"/>
-              </w:rPr>
-            </w:pPr>
-            <w:r>
-              <w:rPr>
-                <w:rFonts w:ascii="Times New Roman" w:eastAsia="Times New Roman" w:hAnsi="Times New Roman" w:cs="Times New Roman"/>
-                <w:sz w:val="24"/>
-                <w:szCs w:val="24"/>
+                <w:highlight w:val="yellow"/>
+                <w:lang w:eastAsia="es-AR"/>
+              </w:rPr>
+            </w:pPr>
+            <w:r>
+              <w:rPr>
+                <w:rFonts w:ascii="Times New Roman" w:eastAsia="Times New Roman" w:hAnsi="Times New Roman" w:cs="Times New Roman"/>
+                <w:sz w:val="24"/>
+                <w:szCs w:val="24"/>
+                <w:highlight w:val="yellow"/>
                 <w:lang w:eastAsia="es-AR"/>
               </w:rPr>
               <w:t>3.3V</w:t>
@@ -317,14 +307,16 @@
                 <w:rFonts w:ascii="Times New Roman" w:eastAsia="Times New Roman" w:hAnsi="Times New Roman" w:cs="Times New Roman"/>
                 <w:sz w:val="24"/>
                 <w:szCs w:val="24"/>
-                <w:lang w:eastAsia="es-AR"/>
-              </w:rPr>
-            </w:pPr>
-            <w:r>
-              <w:rPr>
-                <w:rFonts w:ascii="Times New Roman" w:eastAsia="Times New Roman" w:hAnsi="Times New Roman" w:cs="Times New Roman"/>
-                <w:sz w:val="24"/>
-                <w:szCs w:val="24"/>
+                <w:highlight w:val="yellow"/>
+                <w:lang w:eastAsia="es-AR"/>
+              </w:rPr>
+            </w:pPr>
+            <w:r>
+              <w:rPr>
+                <w:rFonts w:ascii="Times New Roman" w:eastAsia="Times New Roman" w:hAnsi="Times New Roman" w:cs="Times New Roman"/>
+                <w:sz w:val="24"/>
+                <w:szCs w:val="24"/>
+                <w:highlight w:val="yellow"/>
                 <w:lang w:eastAsia="es-AR"/>
               </w:rPr>
               <w:t>Pin 1</w:t>
@@ -349,14 +341,16 @@
                 <w:rFonts w:ascii="Times New Roman" w:eastAsia="Times New Roman" w:hAnsi="Times New Roman" w:cs="Times New Roman"/>
                 <w:sz w:val="24"/>
                 <w:szCs w:val="24"/>
-                <w:lang w:eastAsia="es-AR"/>
-              </w:rPr>
-            </w:pPr>
-            <w:r>
-              <w:rPr>
-                <w:rFonts w:ascii="Times New Roman" w:eastAsia="Times New Roman" w:hAnsi="Times New Roman" w:cs="Times New Roman"/>
-                <w:sz w:val="24"/>
-                <w:szCs w:val="24"/>
+                <w:highlight w:val="yellow"/>
+                <w:lang w:eastAsia="es-AR"/>
+              </w:rPr>
+            </w:pPr>
+            <w:r>
+              <w:rPr>
+                <w:rFonts w:ascii="Times New Roman" w:eastAsia="Times New Roman" w:hAnsi="Times New Roman" w:cs="Times New Roman"/>
+                <w:sz w:val="24"/>
+                <w:szCs w:val="24"/>
+                <w:highlight w:val="yellow"/>
                 <w:lang w:eastAsia="es-AR"/>
               </w:rPr>
               <w:t>GND</w:t>
@@ -376,14 +370,16 @@
                 <w:rFonts w:ascii="Times New Roman" w:eastAsia="Times New Roman" w:hAnsi="Times New Roman" w:cs="Times New Roman"/>
                 <w:sz w:val="24"/>
                 <w:szCs w:val="24"/>
-                <w:lang w:eastAsia="es-AR"/>
-              </w:rPr>
-            </w:pPr>
-            <w:r>
-              <w:rPr>
-                <w:rFonts w:ascii="Times New Roman" w:eastAsia="Times New Roman" w:hAnsi="Times New Roman" w:cs="Times New Roman"/>
-                <w:sz w:val="24"/>
-                <w:szCs w:val="24"/>
+                <w:highlight w:val="yellow"/>
+                <w:lang w:eastAsia="es-AR"/>
+              </w:rPr>
+            </w:pPr>
+            <w:r>
+              <w:rPr>
+                <w:rFonts w:ascii="Times New Roman" w:eastAsia="Times New Roman" w:hAnsi="Times New Roman" w:cs="Times New Roman"/>
+                <w:sz w:val="24"/>
+                <w:szCs w:val="24"/>
+                <w:highlight w:val="yellow"/>
                 <w:lang w:eastAsia="es-AR"/>
               </w:rPr>
               <w:t>GND</w:t>
@@ -403,14 +399,16 @@
                 <w:rFonts w:ascii="Times New Roman" w:eastAsia="Times New Roman" w:hAnsi="Times New Roman" w:cs="Times New Roman"/>
                 <w:sz w:val="24"/>
                 <w:szCs w:val="24"/>
-                <w:lang w:eastAsia="es-AR"/>
-              </w:rPr>
-            </w:pPr>
-            <w:r>
-              <w:rPr>
-                <w:rFonts w:ascii="Times New Roman" w:eastAsia="Times New Roman" w:hAnsi="Times New Roman" w:cs="Times New Roman"/>
-                <w:sz w:val="24"/>
-                <w:szCs w:val="24"/>
+                <w:highlight w:val="yellow"/>
+                <w:lang w:eastAsia="es-AR"/>
+              </w:rPr>
+            </w:pPr>
+            <w:r>
+              <w:rPr>
+                <w:rFonts w:ascii="Times New Roman" w:eastAsia="Times New Roman" w:hAnsi="Times New Roman" w:cs="Times New Roman"/>
+                <w:sz w:val="24"/>
+                <w:szCs w:val="24"/>
+                <w:highlight w:val="yellow"/>
                 <w:lang w:eastAsia="es-AR"/>
               </w:rPr>
               <w:t>Pin 6</w:t>
@@ -435,14 +433,16 @@
                 <w:rFonts w:ascii="Times New Roman" w:eastAsia="Times New Roman" w:hAnsi="Times New Roman" w:cs="Times New Roman"/>
                 <w:sz w:val="24"/>
                 <w:szCs w:val="24"/>
-                <w:lang w:eastAsia="es-AR"/>
-              </w:rPr>
-            </w:pPr>
-            <w:r>
-              <w:rPr>
-                <w:rFonts w:ascii="Times New Roman" w:eastAsia="Times New Roman" w:hAnsi="Times New Roman" w:cs="Times New Roman"/>
-                <w:sz w:val="24"/>
-                <w:szCs w:val="24"/>
+                <w:highlight w:val="yellow"/>
+                <w:lang w:eastAsia="es-AR"/>
+              </w:rPr>
+            </w:pPr>
+            <w:r>
+              <w:rPr>
+                <w:rFonts w:ascii="Times New Roman" w:eastAsia="Times New Roman" w:hAnsi="Times New Roman" w:cs="Times New Roman"/>
+                <w:sz w:val="24"/>
+                <w:szCs w:val="24"/>
+                <w:highlight w:val="yellow"/>
                 <w:lang w:eastAsia="es-AR"/>
               </w:rPr>
               <w:t>SCK</w:t>
@@ -462,14 +462,16 @@
                 <w:rFonts w:ascii="Times New Roman" w:eastAsia="Times New Roman" w:hAnsi="Times New Roman" w:cs="Times New Roman"/>
                 <w:sz w:val="24"/>
                 <w:szCs w:val="24"/>
-                <w:lang w:eastAsia="es-AR"/>
-              </w:rPr>
-            </w:pPr>
-            <w:r>
-              <w:rPr>
-                <w:rFonts w:ascii="Times New Roman" w:eastAsia="Times New Roman" w:hAnsi="Times New Roman" w:cs="Times New Roman"/>
-                <w:sz w:val="24"/>
-                <w:szCs w:val="24"/>
+                <w:highlight w:val="yellow"/>
+                <w:lang w:eastAsia="es-AR"/>
+              </w:rPr>
+            </w:pPr>
+            <w:r>
+              <w:rPr>
+                <w:rFonts w:ascii="Times New Roman" w:eastAsia="Times New Roman" w:hAnsi="Times New Roman" w:cs="Times New Roman"/>
+                <w:sz w:val="24"/>
+                <w:szCs w:val="24"/>
+                <w:highlight w:val="yellow"/>
                 <w:lang w:eastAsia="es-AR"/>
               </w:rPr>
               <w:t>GPIO18</w:t>
@@ -489,14 +491,16 @@
                 <w:rFonts w:ascii="Times New Roman" w:eastAsia="Times New Roman" w:hAnsi="Times New Roman" w:cs="Times New Roman"/>
                 <w:sz w:val="24"/>
                 <w:szCs w:val="24"/>
-                <w:lang w:eastAsia="es-AR"/>
-              </w:rPr>
-            </w:pPr>
-            <w:r>
-              <w:rPr>
-                <w:rFonts w:ascii="Times New Roman" w:eastAsia="Times New Roman" w:hAnsi="Times New Roman" w:cs="Times New Roman"/>
-                <w:sz w:val="24"/>
-                <w:szCs w:val="24"/>
+                <w:highlight w:val="yellow"/>
+                <w:lang w:eastAsia="es-AR"/>
+              </w:rPr>
+            </w:pPr>
+            <w:r>
+              <w:rPr>
+                <w:rFonts w:ascii="Times New Roman" w:eastAsia="Times New Roman" w:hAnsi="Times New Roman" w:cs="Times New Roman"/>
+                <w:sz w:val="24"/>
+                <w:szCs w:val="24"/>
+                <w:highlight w:val="yellow"/>
                 <w:lang w:eastAsia="es-AR"/>
               </w:rPr>
               <w:t>Pin 12</w:t>
@@ -521,14 +525,16 @@
                 <w:rFonts w:ascii="Times New Roman" w:eastAsia="Times New Roman" w:hAnsi="Times New Roman" w:cs="Times New Roman"/>
                 <w:sz w:val="24"/>
                 <w:szCs w:val="24"/>
-                <w:lang w:eastAsia="es-AR"/>
-              </w:rPr>
-            </w:pPr>
-            <w:r>
-              <w:rPr>
-                <w:rFonts w:ascii="Times New Roman" w:eastAsia="Times New Roman" w:hAnsi="Times New Roman" w:cs="Times New Roman"/>
-                <w:sz w:val="24"/>
-                <w:szCs w:val="24"/>
+                <w:highlight w:val="yellow"/>
+                <w:lang w:eastAsia="es-AR"/>
+              </w:rPr>
+            </w:pPr>
+            <w:r>
+              <w:rPr>
+                <w:rFonts w:ascii="Times New Roman" w:eastAsia="Times New Roman" w:hAnsi="Times New Roman" w:cs="Times New Roman"/>
+                <w:sz w:val="24"/>
+                <w:szCs w:val="24"/>
+                <w:highlight w:val="yellow"/>
                 <w:lang w:eastAsia="es-AR"/>
               </w:rPr>
               <w:t>WS</w:t>
@@ -548,14 +554,16 @@
                 <w:rFonts w:ascii="Times New Roman" w:eastAsia="Times New Roman" w:hAnsi="Times New Roman" w:cs="Times New Roman"/>
                 <w:sz w:val="24"/>
                 <w:szCs w:val="24"/>
-                <w:lang w:eastAsia="es-AR"/>
-              </w:rPr>
-            </w:pPr>
-            <w:r>
-              <w:rPr>
-                <w:rFonts w:ascii="Times New Roman" w:eastAsia="Times New Roman" w:hAnsi="Times New Roman" w:cs="Times New Roman"/>
-                <w:sz w:val="24"/>
-                <w:szCs w:val="24"/>
+                <w:highlight w:val="yellow"/>
+                <w:lang w:eastAsia="es-AR"/>
+              </w:rPr>
+            </w:pPr>
+            <w:r>
+              <w:rPr>
+                <w:rFonts w:ascii="Times New Roman" w:eastAsia="Times New Roman" w:hAnsi="Times New Roman" w:cs="Times New Roman"/>
+                <w:sz w:val="24"/>
+                <w:szCs w:val="24"/>
+                <w:highlight w:val="yellow"/>
                 <w:lang w:eastAsia="es-AR"/>
               </w:rPr>
               <w:t>GPIO19</w:t>
@@ -575,14 +583,16 @@
                 <w:rFonts w:ascii="Times New Roman" w:eastAsia="Times New Roman" w:hAnsi="Times New Roman" w:cs="Times New Roman"/>
                 <w:sz w:val="24"/>
                 <w:szCs w:val="24"/>
-                <w:lang w:eastAsia="es-AR"/>
-              </w:rPr>
-            </w:pPr>
-            <w:r>
-              <w:rPr>
-                <w:rFonts w:ascii="Times New Roman" w:eastAsia="Times New Roman" w:hAnsi="Times New Roman" w:cs="Times New Roman"/>
-                <w:sz w:val="24"/>
-                <w:szCs w:val="24"/>
+                <w:highlight w:val="yellow"/>
+                <w:lang w:eastAsia="es-AR"/>
+              </w:rPr>
+            </w:pPr>
+            <w:r>
+              <w:rPr>
+                <w:rFonts w:ascii="Times New Roman" w:eastAsia="Times New Roman" w:hAnsi="Times New Roman" w:cs="Times New Roman"/>
+                <w:sz w:val="24"/>
+                <w:szCs w:val="24"/>
+                <w:highlight w:val="yellow"/>
                 <w:lang w:eastAsia="es-AR"/>
               </w:rPr>
               <w:t>Pin 35</w:t>
@@ -864,8 +874,8 @@
       </w:tblPr>
       <w:tblGrid>
         <w:gridCol w:w="1422"/>
-        <w:gridCol w:w="1427"/>
-        <w:gridCol w:w="1015"/>
+        <w:gridCol w:w="1154"/>
+        <w:gridCol w:w="1312"/>
       </w:tblGrid>
       <w:tr>
         <w:trPr>
@@ -906,7 +916,7 @@
         </w:tc>
         <w:tc>
           <w:tcPr>
-            <w:tcW w:w="0" w:type="auto"/>
+            <w:tcW w:w="1100" w:type="dxa"/>
             <w:vAlign w:val="center"/>
             <w:hideMark/>
           </w:tcPr>
@@ -938,7 +948,7 @@
         </w:tc>
         <w:tc>
           <w:tcPr>
-            <w:tcW w:w="0" w:type="auto"/>
+            <w:tcW w:w="1267" w:type="dxa"/>
             <w:vAlign w:val="center"/>
             <w:hideMark/>
           </w:tcPr>
@@ -1002,7 +1012,7 @@
         </w:tc>
         <w:tc>
           <w:tcPr>
-            <w:tcW w:w="0" w:type="auto"/>
+            <w:tcW w:w="1100" w:type="dxa"/>
             <w:vAlign w:val="center"/>
             <w:hideMark/>
           </w:tcPr>
@@ -1029,7 +1039,7 @@
         </w:tc>
         <w:tc>
           <w:tcPr>
-            <w:tcW w:w="0" w:type="auto"/>
+            <w:tcW w:w="1267" w:type="dxa"/>
             <w:vAlign w:val="center"/>
             <w:hideMark/>
           </w:tcPr>
@@ -1088,7 +1098,7 @@
         </w:tc>
         <w:tc>
           <w:tcPr>
-            <w:tcW w:w="0" w:type="auto"/>
+            <w:tcW w:w="1100" w:type="dxa"/>
             <w:vAlign w:val="center"/>
             <w:hideMark/>
           </w:tcPr>
@@ -1115,28 +1125,37 @@
         </w:tc>
         <w:tc>
           <w:tcPr>
-            <w:tcW w:w="0" w:type="auto"/>
-            <w:vAlign w:val="center"/>
-            <w:hideMark/>
-          </w:tcPr>
-          <w:p>
-            <w:pPr>
-              <w:spacing w:after="0" w:line="240" w:lineRule="auto"/>
-              <w:rPr>
-                <w:rFonts w:ascii="Times New Roman" w:eastAsia="Times New Roman" w:hAnsi="Times New Roman" w:cs="Times New Roman"/>
-                <w:sz w:val="24"/>
-                <w:szCs w:val="24"/>
-                <w:lang w:eastAsia="es-AR"/>
-              </w:rPr>
-            </w:pPr>
-            <w:r>
-              <w:rPr>
-                <w:rFonts w:ascii="Times New Roman" w:eastAsia="Times New Roman" w:hAnsi="Times New Roman" w:cs="Times New Roman"/>
-                <w:sz w:val="24"/>
-                <w:szCs w:val="24"/>
-                <w:lang w:eastAsia="es-AR"/>
-              </w:rPr>
-              <w:t>Pin 6</w:t>
+            <w:tcW w:w="1267" w:type="dxa"/>
+            <w:vAlign w:val="center"/>
+            <w:hideMark/>
+          </w:tcPr>
+          <w:p>
+            <w:pPr>
+              <w:spacing w:after="0" w:line="240" w:lineRule="auto"/>
+              <w:rPr>
+                <w:rFonts w:ascii="Times New Roman" w:eastAsia="Times New Roman" w:hAnsi="Times New Roman" w:cs="Times New Roman"/>
+                <w:sz w:val="24"/>
+                <w:szCs w:val="24"/>
+                <w:lang w:eastAsia="es-AR"/>
+              </w:rPr>
+            </w:pPr>
+            <w:r>
+              <w:rPr>
+                <w:rFonts w:ascii="Times New Roman" w:eastAsia="Times New Roman" w:hAnsi="Times New Roman" w:cs="Times New Roman"/>
+                <w:sz w:val="24"/>
+                <w:szCs w:val="24"/>
+                <w:lang w:eastAsia="es-AR"/>
+              </w:rPr>
+              <w:t xml:space="preserve">Pin </w:t>
+            </w:r>
+            <w:r>
+              <w:rPr>
+                <w:rFonts w:ascii="Times New Roman" w:eastAsia="Times New Roman" w:hAnsi="Times New Roman" w:cs="Times New Roman"/>
+                <w:sz w:val="24"/>
+                <w:szCs w:val="24"/>
+                <w:lang w:eastAsia="es-AR"/>
+              </w:rPr>
+              <w:t>14</w:t>
             </w:r>
           </w:p>
         </w:tc>
@@ -1158,14 +1177,16 @@
                 <w:rFonts w:ascii="Times New Roman" w:eastAsia="Times New Roman" w:hAnsi="Times New Roman" w:cs="Times New Roman"/>
                 <w:sz w:val="24"/>
                 <w:szCs w:val="24"/>
-                <w:lang w:eastAsia="es-AR"/>
-              </w:rPr>
-            </w:pPr>
-            <w:r>
-              <w:rPr>
-                <w:rFonts w:ascii="Times New Roman" w:eastAsia="Times New Roman" w:hAnsi="Times New Roman" w:cs="Times New Roman"/>
-                <w:sz w:val="24"/>
-                <w:szCs w:val="24"/>
+                <w:highlight w:val="yellow"/>
+                <w:lang w:eastAsia="es-AR"/>
+              </w:rPr>
+            </w:pPr>
+            <w:r>
+              <w:rPr>
+                <w:rFonts w:ascii="Times New Roman" w:eastAsia="Times New Roman" w:hAnsi="Times New Roman" w:cs="Times New Roman"/>
+                <w:sz w:val="24"/>
+                <w:szCs w:val="24"/>
+                <w:highlight w:val="yellow"/>
                 <w:lang w:eastAsia="es-AR"/>
               </w:rPr>
               <w:t>BCLK</w:t>
@@ -1174,25 +1195,27 @@
         </w:tc>
         <w:tc>
           <w:tcPr>
-            <w:tcW w:w="0" w:type="auto"/>
-            <w:vAlign w:val="center"/>
-            <w:hideMark/>
-          </w:tcPr>
-          <w:p>
-            <w:pPr>
-              <w:spacing w:after="0" w:line="240" w:lineRule="auto"/>
-              <w:rPr>
-                <w:rFonts w:ascii="Times New Roman" w:eastAsia="Times New Roman" w:hAnsi="Times New Roman" w:cs="Times New Roman"/>
-                <w:sz w:val="24"/>
-                <w:szCs w:val="24"/>
-                <w:lang w:eastAsia="es-AR"/>
-              </w:rPr>
-            </w:pPr>
-            <w:r>
-              <w:rPr>
-                <w:rFonts w:ascii="Times New Roman" w:eastAsia="Times New Roman" w:hAnsi="Times New Roman" w:cs="Times New Roman"/>
-                <w:sz w:val="24"/>
-                <w:szCs w:val="24"/>
+            <w:tcW w:w="1100" w:type="dxa"/>
+            <w:vAlign w:val="center"/>
+            <w:hideMark/>
+          </w:tcPr>
+          <w:p>
+            <w:pPr>
+              <w:spacing w:after="0" w:line="240" w:lineRule="auto"/>
+              <w:rPr>
+                <w:rFonts w:ascii="Times New Roman" w:eastAsia="Times New Roman" w:hAnsi="Times New Roman" w:cs="Times New Roman"/>
+                <w:sz w:val="24"/>
+                <w:szCs w:val="24"/>
+                <w:highlight w:val="yellow"/>
+                <w:lang w:eastAsia="es-AR"/>
+              </w:rPr>
+            </w:pPr>
+            <w:r>
+              <w:rPr>
+                <w:rFonts w:ascii="Times New Roman" w:eastAsia="Times New Roman" w:hAnsi="Times New Roman" w:cs="Times New Roman"/>
+                <w:sz w:val="24"/>
+                <w:szCs w:val="24"/>
+                <w:highlight w:val="yellow"/>
                 <w:lang w:eastAsia="es-AR"/>
               </w:rPr>
               <w:t>GPIO18</w:t>
@@ -1201,25 +1224,27 @@
         </w:tc>
         <w:tc>
           <w:tcPr>
-            <w:tcW w:w="0" w:type="auto"/>
-            <w:vAlign w:val="center"/>
-            <w:hideMark/>
-          </w:tcPr>
-          <w:p>
-            <w:pPr>
-              <w:spacing w:after="0" w:line="240" w:lineRule="auto"/>
-              <w:rPr>
-                <w:rFonts w:ascii="Times New Roman" w:eastAsia="Times New Roman" w:hAnsi="Times New Roman" w:cs="Times New Roman"/>
-                <w:sz w:val="24"/>
-                <w:szCs w:val="24"/>
-                <w:lang w:eastAsia="es-AR"/>
-              </w:rPr>
-            </w:pPr>
-            <w:r>
-              <w:rPr>
-                <w:rFonts w:ascii="Times New Roman" w:eastAsia="Times New Roman" w:hAnsi="Times New Roman" w:cs="Times New Roman"/>
-                <w:sz w:val="24"/>
-                <w:szCs w:val="24"/>
+            <w:tcW w:w="1267" w:type="dxa"/>
+            <w:vAlign w:val="center"/>
+            <w:hideMark/>
+          </w:tcPr>
+          <w:p>
+            <w:pPr>
+              <w:spacing w:after="0" w:line="240" w:lineRule="auto"/>
+              <w:rPr>
+                <w:rFonts w:ascii="Times New Roman" w:eastAsia="Times New Roman" w:hAnsi="Times New Roman" w:cs="Times New Roman"/>
+                <w:sz w:val="24"/>
+                <w:szCs w:val="24"/>
+                <w:highlight w:val="yellow"/>
+                <w:lang w:eastAsia="es-AR"/>
+              </w:rPr>
+            </w:pPr>
+            <w:r>
+              <w:rPr>
+                <w:rFonts w:ascii="Times New Roman" w:eastAsia="Times New Roman" w:hAnsi="Times New Roman" w:cs="Times New Roman"/>
+                <w:sz w:val="24"/>
+                <w:szCs w:val="24"/>
+                <w:highlight w:val="yellow"/>
                 <w:lang w:eastAsia="es-AR"/>
               </w:rPr>
               <w:t>Pin 12</w:t>
@@ -1244,14 +1269,16 @@
                 <w:rFonts w:ascii="Times New Roman" w:eastAsia="Times New Roman" w:hAnsi="Times New Roman" w:cs="Times New Roman"/>
                 <w:sz w:val="24"/>
                 <w:szCs w:val="24"/>
-                <w:lang w:eastAsia="es-AR"/>
-              </w:rPr>
-            </w:pPr>
-            <w:r>
-              <w:rPr>
-                <w:rFonts w:ascii="Times New Roman" w:eastAsia="Times New Roman" w:hAnsi="Times New Roman" w:cs="Times New Roman"/>
-                <w:sz w:val="24"/>
-                <w:szCs w:val="24"/>
+                <w:highlight w:val="yellow"/>
+                <w:lang w:eastAsia="es-AR"/>
+              </w:rPr>
+            </w:pPr>
+            <w:r>
+              <w:rPr>
+                <w:rFonts w:ascii="Times New Roman" w:eastAsia="Times New Roman" w:hAnsi="Times New Roman" w:cs="Times New Roman"/>
+                <w:sz w:val="24"/>
+                <w:szCs w:val="24"/>
+                <w:highlight w:val="yellow"/>
                 <w:lang w:eastAsia="es-AR"/>
               </w:rPr>
               <w:t>LRC</w:t>
@@ -1260,25 +1287,27 @@
         </w:tc>
         <w:tc>
           <w:tcPr>
-            <w:tcW w:w="0" w:type="auto"/>
-            <w:vAlign w:val="center"/>
-            <w:hideMark/>
-          </w:tcPr>
-          <w:p>
-            <w:pPr>
-              <w:spacing w:after="0" w:line="240" w:lineRule="auto"/>
-              <w:rPr>
-                <w:rFonts w:ascii="Times New Roman" w:eastAsia="Times New Roman" w:hAnsi="Times New Roman" w:cs="Times New Roman"/>
-                <w:sz w:val="24"/>
-                <w:szCs w:val="24"/>
-                <w:lang w:eastAsia="es-AR"/>
-              </w:rPr>
-            </w:pPr>
-            <w:r>
-              <w:rPr>
-                <w:rFonts w:ascii="Times New Roman" w:eastAsia="Times New Roman" w:hAnsi="Times New Roman" w:cs="Times New Roman"/>
-                <w:sz w:val="24"/>
-                <w:szCs w:val="24"/>
+            <w:tcW w:w="1100" w:type="dxa"/>
+            <w:vAlign w:val="center"/>
+            <w:hideMark/>
+          </w:tcPr>
+          <w:p>
+            <w:pPr>
+              <w:spacing w:after="0" w:line="240" w:lineRule="auto"/>
+              <w:rPr>
+                <w:rFonts w:ascii="Times New Roman" w:eastAsia="Times New Roman" w:hAnsi="Times New Roman" w:cs="Times New Roman"/>
+                <w:sz w:val="24"/>
+                <w:szCs w:val="24"/>
+                <w:highlight w:val="yellow"/>
+                <w:lang w:eastAsia="es-AR"/>
+              </w:rPr>
+            </w:pPr>
+            <w:r>
+              <w:rPr>
+                <w:rFonts w:ascii="Times New Roman" w:eastAsia="Times New Roman" w:hAnsi="Times New Roman" w:cs="Times New Roman"/>
+                <w:sz w:val="24"/>
+                <w:szCs w:val="24"/>
+                <w:highlight w:val="yellow"/>
                 <w:lang w:eastAsia="es-AR"/>
               </w:rPr>
               <w:t>GPIO19</w:t>
@@ -1287,25 +1316,27 @@
         </w:tc>
         <w:tc>
           <w:tcPr>
-            <w:tcW w:w="0" w:type="auto"/>
-            <w:vAlign w:val="center"/>
-            <w:hideMark/>
-          </w:tcPr>
-          <w:p>
-            <w:pPr>
-              <w:spacing w:after="0" w:line="240" w:lineRule="auto"/>
-              <w:rPr>
-                <w:rFonts w:ascii="Times New Roman" w:eastAsia="Times New Roman" w:hAnsi="Times New Roman" w:cs="Times New Roman"/>
-                <w:sz w:val="24"/>
-                <w:szCs w:val="24"/>
-                <w:lang w:eastAsia="es-AR"/>
-              </w:rPr>
-            </w:pPr>
-            <w:r>
-              <w:rPr>
-                <w:rFonts w:ascii="Times New Roman" w:eastAsia="Times New Roman" w:hAnsi="Times New Roman" w:cs="Times New Roman"/>
-                <w:sz w:val="24"/>
-                <w:szCs w:val="24"/>
+            <w:tcW w:w="1267" w:type="dxa"/>
+            <w:vAlign w:val="center"/>
+            <w:hideMark/>
+          </w:tcPr>
+          <w:p>
+            <w:pPr>
+              <w:spacing w:after="0" w:line="240" w:lineRule="auto"/>
+              <w:rPr>
+                <w:rFonts w:ascii="Times New Roman" w:eastAsia="Times New Roman" w:hAnsi="Times New Roman" w:cs="Times New Roman"/>
+                <w:sz w:val="24"/>
+                <w:szCs w:val="24"/>
+                <w:highlight w:val="yellow"/>
+                <w:lang w:eastAsia="es-AR"/>
+              </w:rPr>
+            </w:pPr>
+            <w:r>
+              <w:rPr>
+                <w:rFonts w:ascii="Times New Roman" w:eastAsia="Times New Roman" w:hAnsi="Times New Roman" w:cs="Times New Roman"/>
+                <w:sz w:val="24"/>
+                <w:szCs w:val="24"/>
+                <w:highlight w:val="yellow"/>
                 <w:lang w:eastAsia="es-AR"/>
               </w:rPr>
               <w:t>Pin 35</w:t>
@@ -1346,7 +1377,7 @@
         </w:tc>
         <w:tc>
           <w:tcPr>
-            <w:tcW w:w="0" w:type="auto"/>
+            <w:tcW w:w="1100" w:type="dxa"/>
             <w:vAlign w:val="center"/>
             <w:hideMark/>
           </w:tcPr>
@@ -1373,7 +1404,7 @@
         </w:tc>
         <w:tc>
           <w:tcPr>
-            <w:tcW w:w="0" w:type="auto"/>
+            <w:tcW w:w="1267" w:type="dxa"/>
             <w:vAlign w:val="center"/>
             <w:hideMark/>
           </w:tcPr>
@@ -1432,7 +1463,7 @@
         </w:tc>
         <w:tc>
           <w:tcPr>
-            <w:tcW w:w="0" w:type="auto"/>
+            <w:tcW w:w="1100" w:type="dxa"/>
             <w:vAlign w:val="center"/>
             <w:hideMark/>
           </w:tcPr>
@@ -1459,7 +1490,7 @@
         </w:tc>
         <w:tc>
           <w:tcPr>
-            <w:tcW w:w="0" w:type="auto"/>
+            <w:tcW w:w="1267" w:type="dxa"/>
             <w:vAlign w:val="center"/>
             <w:hideMark/>
           </w:tcPr>
@@ -1790,7 +1821,27 @@
                 <w:szCs w:val="24"/>
                 <w:lang w:eastAsia="es-AR"/>
               </w:rPr>
-              <w:t>compartir (cable en Y / protoboard)</w:t>
+              <w:t xml:space="preserve">compartir (cable en Y / </w:t>
+            </w:r>
+            <w:proofErr w:type="spellStart"/>
+            <w:r>
+              <w:rPr>
+                <w:rFonts w:ascii="Times New Roman" w:eastAsia="Times New Roman" w:hAnsi="Times New Roman" w:cs="Times New Roman"/>
+                <w:sz w:val="24"/>
+                <w:szCs w:val="24"/>
+                <w:lang w:eastAsia="es-AR"/>
+              </w:rPr>
+              <w:t>protoboard</w:t>
+            </w:r>
+            <w:proofErr w:type="spellEnd"/>
+            <w:r>
+              <w:rPr>
+                <w:rFonts w:ascii="Times New Roman" w:eastAsia="Times New Roman" w:hAnsi="Times New Roman" w:cs="Times New Roman"/>
+                <w:sz w:val="24"/>
+                <w:szCs w:val="24"/>
+                <w:lang w:eastAsia="es-AR"/>
+              </w:rPr>
+              <w:t>)</w:t>
             </w:r>
           </w:p>
         </w:tc>
@@ -1876,7 +1927,27 @@
                 <w:szCs w:val="24"/>
                 <w:lang w:eastAsia="es-AR"/>
               </w:rPr>
-              <w:t>compartir (cable en Y / protoboard)</w:t>
+              <w:t xml:space="preserve">compartir (cable en Y / </w:t>
+            </w:r>
+            <w:proofErr w:type="spellStart"/>
+            <w:r>
+              <w:rPr>
+                <w:rFonts w:ascii="Times New Roman" w:eastAsia="Times New Roman" w:hAnsi="Times New Roman" w:cs="Times New Roman"/>
+                <w:sz w:val="24"/>
+                <w:szCs w:val="24"/>
+                <w:lang w:eastAsia="es-AR"/>
+              </w:rPr>
+              <w:t>protoboard</w:t>
+            </w:r>
+            <w:proofErr w:type="spellEnd"/>
+            <w:r>
+              <w:rPr>
+                <w:rFonts w:ascii="Times New Roman" w:eastAsia="Times New Roman" w:hAnsi="Times New Roman" w:cs="Times New Roman"/>
+                <w:sz w:val="24"/>
+                <w:szCs w:val="24"/>
+                <w:lang w:eastAsia="es-AR"/>
+              </w:rPr>
+              <w:t>)</w:t>
             </w:r>
           </w:p>
         </w:tc>

</xml_diff>